<commit_message>
Changing name from c2 to c3
</commit_message>
<xml_diff>
--- a/reports/Student #3/C2/03 - Requirements - Student #3.docx
+++ b/reports/Student #3/C2/03 - Requirements - Student #3.docx
@@ -4,7 +4,7 @@
   <w:body>
     <w:p>
       <w:pPr>
-        <w:pStyle w:val="Ttulo1"/>
+        <w:pStyle w:val="Heading1"/>
       </w:pPr>
       <w:r>
         <w:t>Requirements – Student #3</w:t>
@@ -30,7 +30,10 @@
         <w:t>Please, note that this document must be edited with the desktop version of Word since the web version does not properly support forms.</w:t>
       </w:r>
       <w:r>
-        <w:t xml:space="preserve"> Attaching this document entails that you are the authors of the work delivered, you have not cheated in any way, and you have read and understood the information delivered regarding the subject, with a special emphasis on the methodological guidelines and how your work is going to be graded. Make sure that your project works well with the latest version of the development framework.</w:t>
+        <w:t xml:space="preserve"> Attaching this document entails that you are the authors of the work delivered, you have not cheated in any way, and you have read and understood the information delivered regarding the subject, with a special emphas</w:t>
+      </w:r>
+      <w:r>
+        <w:t>is on the methodological guidelines and how your work is going to be graded. Make sure that your project works well with the latest version of the development framework.</w:t>
       </w:r>
     </w:p>
     <w:p/>
@@ -105,7 +108,23 @@
                 <w:szCs w:val="22"/>
               </w:rPr>
               <w:tab/>
-              <w:t xml:space="preserve"> C1.029</w:t>
+              <w:t xml:space="preserve"> C</w:t>
+            </w:r>
+            <w:r>
+              <w:rPr>
+                <w:color w:val="000000"/>
+                <w:sz w:val="22"/>
+                <w:szCs w:val="22"/>
+              </w:rPr>
+              <w:t>2</w:t>
+            </w:r>
+            <w:r>
+              <w:rPr>
+                <w:color w:val="000000"/>
+                <w:sz w:val="22"/>
+                <w:szCs w:val="22"/>
+              </w:rPr>
+              <w:t>.029</w:t>
             </w:r>
           </w:p>
         </w:tc>
@@ -472,10 +491,9 @@
     </w:tbl>
     <w:p>
       <w:pPr>
-        <w:pStyle w:val="Ttulo1"/>
-      </w:pPr>
-      <w:r>
-        <w:lastRenderedPageBreak/>
+        <w:pStyle w:val="Heading1"/>
+      </w:pPr>
+      <w:r>
         <w:t xml:space="preserve">MANDATORY </w:t>
       </w:r>
       <w:r>
@@ -485,7 +503,7 @@
     </w:p>
     <w:p>
       <w:pPr>
-        <w:pStyle w:val="Ttulo2"/>
+        <w:pStyle w:val="Heading2"/>
       </w:pPr>
       <w:r>
         <w:t xml:space="preserve">Information requirements </w:t>
@@ -498,7 +516,7 @@
     </w:p>
     <w:p>
       <w:pPr>
-        <w:pStyle w:val="Ttulo2"/>
+        <w:pStyle w:val="Heading2"/>
       </w:pPr>
       <w:r>
         <w:t>Functional requirements</w:t>
@@ -719,7 +737,7 @@
     </w:p>
     <w:p>
       <w:pPr>
-        <w:pStyle w:val="Ttulo2"/>
+        <w:pStyle w:val="Heading2"/>
       </w:pPr>
       <w:r>
         <w:t>Non-functional requirements</w:t>
@@ -732,7 +750,7 @@
     </w:p>
     <w:p>
       <w:pPr>
-        <w:pStyle w:val="Ttulo2"/>
+        <w:pStyle w:val="Heading2"/>
       </w:pPr>
       <w:r>
         <w:t>Testing requirements</w:t>
@@ -745,7 +763,7 @@
     </w:p>
     <w:p>
       <w:pPr>
-        <w:pStyle w:val="Ttulo2"/>
+        <w:pStyle w:val="Heading2"/>
       </w:pPr>
       <w:r>
         <w:t>Managerial requirements</w:t>
@@ -792,12 +810,14 @@
         <w:rPr>
           <w:sz w:val="22"/>
           <w:szCs w:val="22"/>
-        </w:rPr>
-      </w:pPr>
-      <w:r>
-        <w:rPr>
-          <w:sz w:val="22"/>
-          <w:szCs w:val="22"/>
+          <w:lang w:val="es-ES"/>
+        </w:rPr>
+      </w:pPr>
+      <w:r>
+        <w:rPr>
+          <w:sz w:val="22"/>
+          <w:szCs w:val="22"/>
+          <w:lang w:val="es-ES"/>
         </w:rPr>
         <w:t>X  Mismos problemas que los comentados en el documento de requisitos grupales.</w:t>
       </w:r>
@@ -826,6 +846,7 @@
         <w:rPr>
           <w:sz w:val="22"/>
           <w:szCs w:val="22"/>
+          <w:lang w:val="es-ES"/>
         </w:rPr>
         <w:t xml:space="preserve">En el documento de requisitos grupales se comentó: </w:t>
       </w:r>
@@ -855,12 +876,14 @@
         <w:rPr>
           <w:sz w:val="22"/>
           <w:szCs w:val="22"/>
-        </w:rPr>
-      </w:pPr>
-      <w:r>
-        <w:rPr>
-          <w:sz w:val="22"/>
-          <w:szCs w:val="22"/>
+          <w:lang w:val="es-ES"/>
+        </w:rPr>
+      </w:pPr>
+      <w:r>
+        <w:rPr>
+          <w:sz w:val="22"/>
+          <w:szCs w:val="22"/>
+          <w:lang w:val="es-ES"/>
         </w:rPr>
         <w:t>Corrección:</w:t>
       </w:r>
@@ -868,6 +891,7 @@
         <w:rPr>
           <w:sz w:val="22"/>
           <w:szCs w:val="22"/>
+          <w:lang w:val="es-ES"/>
         </w:rPr>
         <w:t xml:space="preserve"> Para el primer problema, he creado tareas de </w:t>
       </w:r>
@@ -875,6 +899,7 @@
         <w:rPr>
           <w:sz w:val="22"/>
           <w:szCs w:val="22"/>
+          <w:lang w:val="es-ES"/>
         </w:rPr>
         <w:t>a</w:t>
       </w:r>
@@ -882,6 +907,7 @@
         <w:rPr>
           <w:sz w:val="22"/>
           <w:szCs w:val="22"/>
+          <w:lang w:val="es-ES"/>
         </w:rPr>
         <w:t>sistencia a clases</w:t>
       </w:r>
@@ -889,6 +915,7 @@
         <w:rPr>
           <w:sz w:val="22"/>
           <w:szCs w:val="22"/>
+          <w:lang w:val="es-ES"/>
         </w:rPr>
         <w:t>, que no he faltado a ninguna ni de laboratorio ni de teoría.</w:t>
       </w:r>
@@ -972,14 +999,15 @@
         <w:rPr>
           <w:sz w:val="22"/>
           <w:szCs w:val="22"/>
-        </w:rPr>
-      </w:pPr>
-      <w:r>
-        <w:rPr>
-          <w:sz w:val="22"/>
-          <w:szCs w:val="22"/>
-        </w:rPr>
-        <w:lastRenderedPageBreak/>
+          <w:lang w:val="es-ES"/>
+        </w:rPr>
+      </w:pPr>
+      <w:r>
+        <w:rPr>
+          <w:sz w:val="22"/>
+          <w:szCs w:val="22"/>
+          <w:lang w:val="es-ES"/>
+        </w:rPr>
         <w:t>Para el segundo problema, he creado una tarea por cada entregable de preparación de la entrega. Que obviamente había hecho el trabajo de preparar la entrega pero no había creado la issue.</w:t>
       </w:r>
     </w:p>
@@ -1068,6 +1096,7 @@
         <w:rPr>
           <w:sz w:val="22"/>
           <w:szCs w:val="22"/>
+          <w:lang w:val="es-ES"/>
         </w:rPr>
         <w:t>Por último,</w:t>
       </w:r>
@@ -1075,6 +1104,7 @@
         <w:rPr>
           <w:sz w:val="22"/>
           <w:szCs w:val="22"/>
+          <w:lang w:val="es-ES"/>
         </w:rPr>
         <w:t xml:space="preserve"> </w:t>
       </w:r>
@@ -1082,6 +1112,7 @@
         <w:rPr>
           <w:sz w:val="22"/>
           <w:szCs w:val="22"/>
+          <w:lang w:val="es-ES"/>
         </w:rPr>
         <w:t xml:space="preserve">tenía </w:t>
       </w:r>
@@ -1089,6 +1120,7 @@
         <w:rPr>
           <w:sz w:val="22"/>
           <w:szCs w:val="22"/>
+          <w:lang w:val="es-ES"/>
         </w:rPr>
         <w:t>tareas de revisi</w:t>
       </w:r>
@@ -1096,6 +1128,7 @@
         <w:rPr>
           <w:sz w:val="22"/>
           <w:szCs w:val="22"/>
+          <w:lang w:val="es-ES"/>
         </w:rPr>
         <w:t>ó</w:t>
       </w:r>
@@ -1103,6 +1136,7 @@
         <w:rPr>
           <w:sz w:val="22"/>
           <w:szCs w:val="22"/>
+          <w:lang w:val="es-ES"/>
         </w:rPr>
         <w:t>n de cada issue pero no las tenía cerradas en github,</w:t>
       </w:r>
@@ -1110,6 +1144,7 @@
         <w:rPr>
           <w:sz w:val="22"/>
           <w:szCs w:val="22"/>
+          <w:lang w:val="es-ES"/>
         </w:rPr>
         <w:t>por lo que no constaba que lo hubiese hecho,</w:t>
       </w:r>
@@ -1117,6 +1152,7 @@
         <w:rPr>
           <w:sz w:val="22"/>
           <w:szCs w:val="22"/>
+          <w:lang w:val="es-ES"/>
         </w:rPr>
         <w:t xml:space="preserve"> por lo que he cerrado las tareas que he revisado. Si se fija, Las tareas de revision Task XXX/TXXX – descripción. Se refiere a las revision de la tareas XXX. Si he visto que algo no esta correcto he creado otra tarea llamada Task XXX/R1. Si al Volver a hacer esta revisón no está correcto, vuelvo a crear otra Task XXX/R2 y así sucesivamente.</w:t>
       </w:r>
@@ -1124,8 +1160,16 @@
         <w:rPr>
           <w:sz w:val="22"/>
           <w:szCs w:val="22"/>
-        </w:rPr>
-        <w:t xml:space="preserve"> Aquí dejo un ejemplo de ello:</w:t>
+          <w:lang w:val="es-ES"/>
+        </w:rPr>
+        <w:t xml:space="preserve"> </w:t>
+      </w:r>
+      <w:r>
+        <w:rPr>
+          <w:sz w:val="22"/>
+          <w:szCs w:val="22"/>
+        </w:rPr>
+        <w:t>Aquí dejo un ejemplo de ello:</w:t>
       </w:r>
     </w:p>
     <w:p>
@@ -1216,10 +1260,9 @@
     </w:p>
     <w:p>
       <w:pPr>
-        <w:pStyle w:val="Ttulo1"/>
-      </w:pPr>
-      <w:r>
-        <w:lastRenderedPageBreak/>
+        <w:pStyle w:val="Heading1"/>
+      </w:pPr>
+      <w:r>
         <w:t xml:space="preserve">MANDATORY </w:t>
       </w:r>
       <w:r>
@@ -1229,7 +1272,7 @@
     </w:p>
     <w:p>
       <w:pPr>
-        <w:pStyle w:val="Ttulo2"/>
+        <w:pStyle w:val="Heading2"/>
       </w:pPr>
       <w:r>
         <w:t>Information requirements</w:t>
@@ -1344,7 +1387,13 @@
         <w:rPr>
           <w:color w:val="000000"/>
         </w:rPr>
-        <w:t xml:space="preserve">. Optionally, the system may store his or her </w:t>
+        <w:t xml:space="preserve">. Optionally, the </w:t>
+      </w:r>
+      <w:r>
+        <w:rPr>
+          <w:color w:val="000000"/>
+        </w:rPr>
+        <w:t xml:space="preserve">system may store his or her </w:t>
       </w:r>
       <w:r>
         <w:rPr>
@@ -1670,7 +1719,13 @@
         <w:rPr>
           <w:color w:val="000000"/>
         </w:rPr>
-        <w:t xml:space="preserve"> (ranging from 0 to 10, where 0 indicates no issue and 10 represents a highly critical situation).  </w:t>
+        <w:t xml:space="preserve"> (ranging from 0 to 10, where 0 indicates </w:t>
+      </w:r>
+      <w:r>
+        <w:rPr>
+          <w:color w:val="000000"/>
+        </w:rPr>
+        <w:t xml:space="preserve">no issue and 10 represents a highly critical situation).  </w:t>
       </w:r>
     </w:p>
     <w:p>
@@ -1714,7 +1769,7 @@
     </w:p>
     <w:p>
       <w:pPr>
-        <w:pStyle w:val="Ttulo2"/>
+        <w:pStyle w:val="Heading2"/>
       </w:pPr>
       <w:r>
         <w:t>Functional requirements</w:t>
@@ -1727,7 +1782,7 @@
     </w:p>
     <w:p>
       <w:pPr>
-        <w:pStyle w:val="Ttulo2"/>
+        <w:pStyle w:val="Heading2"/>
       </w:pPr>
       <w:r>
         <w:t>Non-functional requirements</w:t>
@@ -1740,10 +1795,9 @@
     </w:p>
     <w:p>
       <w:pPr>
-        <w:pStyle w:val="Ttulo2"/>
-      </w:pPr>
-      <w:r>
-        <w:lastRenderedPageBreak/>
+        <w:pStyle w:val="Heading2"/>
+      </w:pPr>
+      <w:r>
         <w:t>Testing requirements</w:t>
       </w:r>
     </w:p>
@@ -1885,7 +1939,7 @@
     </w:p>
     <w:p>
       <w:pPr>
-        <w:pStyle w:val="Ttulo2"/>
+        <w:pStyle w:val="Heading2"/>
       </w:pPr>
       <w:r>
         <w:t>Managerial requirements</w:t>
@@ -1955,10 +2009,9 @@
     <w:p/>
     <w:p>
       <w:pPr>
-        <w:pStyle w:val="Ttulo1"/>
-      </w:pPr>
-      <w:r>
-        <w:lastRenderedPageBreak/>
+        <w:pStyle w:val="Heading1"/>
+      </w:pPr>
+      <w:r>
         <w:t xml:space="preserve">MANDATORY </w:t>
       </w:r>
       <w:r>
@@ -1968,7 +2021,7 @@
     </w:p>
     <w:p>
       <w:pPr>
-        <w:pStyle w:val="Ttulo2"/>
+        <w:pStyle w:val="Heading2"/>
       </w:pPr>
       <w:r>
         <w:t>Information requirements</w:t>
@@ -1981,7 +2034,7 @@
     </w:p>
     <w:p>
       <w:pPr>
-        <w:pStyle w:val="Ttulo2"/>
+        <w:pStyle w:val="Heading2"/>
       </w:pPr>
       <w:r>
         <w:t>Functional requirements</w:t>
@@ -2100,7 +2153,13 @@
         <w:rPr>
           <w:color w:val="000000"/>
         </w:rPr>
-        <w:t>Create, update, and publish their flight assignments. Only crew members with duty “LEAD ATTENDANT” can perform these operations. Please, note that to publish a flight assignment these cannot be linked to legs that have already occurred.  Additionally, only flight crew members with an "AVAILABLE" status can be assigned to a leg, and they cannot be assigned to multiple legs simultaneously.  Lastly, each leg can only have one pilot and one co-pilot.  The allocation of remaining roles for other flight crew members is at the discretion of the “LEAD ATTENDANT”.  Flight assignments can be updated or deleted as long as they have not been published.</w:t>
+        <w:t>Create, update, and publish their flight assignments. Only crew members with duty “LEAD ATTENDANT” can perform these operations. Please, note that to publish a flight assignment these cannot be linked to legs that have already occurred.  Additionally, only flight crew members with an "AVAILABLE" status can be assigned to a leg, and they cannot be assigned to multiple legs simultaneously.  Lastly, each leg can only have one pilot and one co-pilot.  The allocation of remaining roles for other flight crew memb</w:t>
+      </w:r>
+      <w:r>
+        <w:rPr>
+          <w:color w:val="000000"/>
+        </w:rPr>
+        <w:t>ers is at the discretion of the “LEAD ATTENDANT”.  Flight assignments can be updated or deleted as long as they have not been published.</w:t>
       </w:r>
     </w:p>
     <w:p>
@@ -2121,13 +2180,15 @@
           <w:color w:val="000000"/>
           <w:sz w:val="22"/>
           <w:szCs w:val="22"/>
-        </w:rPr>
-      </w:pPr>
-      <w:r>
-        <w:rPr>
-          <w:color w:val="000000"/>
-          <w:sz w:val="22"/>
-          <w:szCs w:val="22"/>
+          <w:lang w:val="es-ES"/>
+        </w:rPr>
+      </w:pPr>
+      <w:r>
+        <w:rPr>
+          <w:color w:val="000000"/>
+          <w:sz w:val="22"/>
+          <w:szCs w:val="22"/>
+          <w:lang w:val="es-ES"/>
         </w:rPr>
         <w:t>El requisito no estaba marcado no obstante lo he comprobado. Si intento crear un flight assignment, se cargan todas las legs, estén publicadas o no y estén el futuro o no. Aquí paramos la evaluación.</w:t>
       </w:r>
@@ -2150,13 +2211,15 @@
           <w:color w:val="000000"/>
           <w:sz w:val="22"/>
           <w:szCs w:val="22"/>
-        </w:rPr>
-      </w:pPr>
-      <w:r>
-        <w:rPr>
-          <w:color w:val="000000"/>
-          <w:sz w:val="22"/>
-          <w:szCs w:val="22"/>
+          <w:lang w:val="es-ES"/>
+        </w:rPr>
+      </w:pPr>
+      <w:r>
+        <w:rPr>
+          <w:color w:val="000000"/>
+          <w:sz w:val="22"/>
+          <w:szCs w:val="22"/>
+          <w:lang w:val="es-ES"/>
         </w:rPr>
         <w:t>Para solucionar el problema del CREATE lo que he he</w:t>
       </w:r>
@@ -2165,6 +2228,7 @@
           <w:color w:val="000000"/>
           <w:sz w:val="22"/>
           <w:szCs w:val="22"/>
+          <w:lang w:val="es-ES"/>
         </w:rPr>
         <w:t>ch</w:t>
       </w:r>
@@ -2173,6 +2237,7 @@
           <w:color w:val="000000"/>
           <w:sz w:val="22"/>
           <w:szCs w:val="22"/>
+          <w:lang w:val="es-ES"/>
         </w:rPr>
         <w:t>o ha sido modificar el unbind, para que los datos que se traiga de la base de datos sean solo las legs futuras y publicadas.</w:t>
       </w:r>
@@ -2256,15 +2321,16 @@
           <w:color w:val="000000"/>
           <w:sz w:val="22"/>
           <w:szCs w:val="22"/>
-        </w:rPr>
-      </w:pPr>
-      <w:r>
-        <w:rPr>
-          <w:color w:val="000000"/>
-          <w:sz w:val="22"/>
-          <w:szCs w:val="22"/>
-        </w:rPr>
-        <w:lastRenderedPageBreak/>
+          <w:lang w:val="es-ES"/>
+        </w:rPr>
+      </w:pPr>
+      <w:r>
+        <w:rPr>
+          <w:color w:val="000000"/>
+          <w:sz w:val="22"/>
+          <w:szCs w:val="22"/>
+          <w:lang w:val="es-ES"/>
+        </w:rPr>
         <w:t>He creado Tambien en el repository la function finPublishedFutureLegs.</w:t>
       </w:r>
     </w:p>
@@ -2350,13 +2416,15 @@
           <w:color w:val="000000"/>
           <w:sz w:val="22"/>
           <w:szCs w:val="22"/>
-        </w:rPr>
-      </w:pPr>
-      <w:r>
-        <w:rPr>
-          <w:color w:val="000000"/>
-          <w:sz w:val="22"/>
-          <w:szCs w:val="22"/>
+          <w:lang w:val="es-ES"/>
+        </w:rPr>
+      </w:pPr>
+      <w:r>
+        <w:rPr>
+          <w:color w:val="000000"/>
+          <w:sz w:val="22"/>
+          <w:szCs w:val="22"/>
+          <w:lang w:val="es-ES"/>
         </w:rPr>
         <w:t>En el SHOW he puesto que no puedas cambiar la leg. Si quieres cambiarla, deberás de crear una flightAssignment nueva.</w:t>
       </w:r>
@@ -2461,13 +2529,15 @@
           <w:color w:val="000000"/>
           <w:sz w:val="22"/>
           <w:szCs w:val="22"/>
-        </w:rPr>
-      </w:pPr>
-      <w:r>
-        <w:rPr>
-          <w:color w:val="000000"/>
-          <w:sz w:val="22"/>
-          <w:szCs w:val="22"/>
+          <w:lang w:val="es-ES"/>
+        </w:rPr>
+      </w:pPr>
+      <w:r>
+        <w:rPr>
+          <w:color w:val="000000"/>
+          <w:sz w:val="22"/>
+          <w:szCs w:val="22"/>
+          <w:lang w:val="es-ES"/>
         </w:rPr>
         <w:t xml:space="preserve">En la base de datos tengo un flightAssignmentPlanned con legs que no están publicadas(member4), pero </w:t>
       </w:r>
@@ -2490,87 +2560,17 @@
           <w:color w:val="000000"/>
           <w:sz w:val="22"/>
           <w:szCs w:val="22"/>
-        </w:rPr>
-      </w:pPr>
-      <w:r>
-        <w:rPr>
-          <w:color w:val="000000"/>
-          <w:sz w:val="22"/>
-          <w:szCs w:val="22"/>
-        </w:rPr>
-        <w:t>He puesto en los validadores tanto de UPDATE como de PUBLISH que no se puedan llevar a cabo la acción de actualiz</w:t>
-      </w:r>
-      <w:r>
-        <w:rPr>
-          <w:color w:val="000000"/>
-          <w:sz w:val="22"/>
-          <w:szCs w:val="22"/>
-        </w:rPr>
-        <w:t>a</w:t>
-      </w:r>
-      <w:r>
-        <w:rPr>
-          <w:color w:val="000000"/>
-          <w:sz w:val="22"/>
-          <w:szCs w:val="22"/>
-        </w:rPr>
-        <w:t xml:space="preserve">r o publicar un flightAssignment que la leg no este publicada o en </w:t>
-      </w:r>
-      <w:r>
-        <w:rPr>
-          <w:color w:val="000000"/>
-          <w:sz w:val="22"/>
-          <w:szCs w:val="22"/>
-        </w:rPr>
-        <w:t>futuro (Aunque no sigue la lógica del create y del Proyecto, me he dado cuenta que si el CSV tenía algun flightAssignmenr con una leg no publicada se podia actualizar o publicar)</w:t>
-      </w:r>
-      <w:r>
-        <w:rPr>
-          <w:color w:val="000000"/>
-          <w:sz w:val="22"/>
-          <w:szCs w:val="22"/>
-        </w:rPr>
-        <w:t xml:space="preserve">. </w:t>
-      </w:r>
-      <w:r>
-        <w:rPr>
-          <w:color w:val="000000"/>
-          <w:sz w:val="22"/>
-          <w:szCs w:val="22"/>
-        </w:rPr>
-        <w:t xml:space="preserve">Despueés de darme cuenta de esto he hecho solucionado todos los fallos del </w:t>
-      </w:r>
-      <w:r>
-        <w:rPr>
-          <w:color w:val="000000"/>
-          <w:sz w:val="22"/>
-          <w:szCs w:val="22"/>
-        </w:rPr>
-        <w:t>CSV tenía</w:t>
-      </w:r>
-      <w:r>
-        <w:rPr>
-          <w:color w:val="000000"/>
-          <w:sz w:val="22"/>
-          <w:szCs w:val="22"/>
-        </w:rPr>
-        <w:t xml:space="preserve"> ya que</w:t>
-      </w:r>
-      <w:r>
-        <w:rPr>
-          <w:color w:val="000000"/>
-          <w:sz w:val="22"/>
-          <w:szCs w:val="22"/>
-        </w:rPr>
-        <w:t xml:space="preserve"> </w:t>
-      </w:r>
-      <w:r>
-        <w:rPr>
-          <w:color w:val="000000"/>
-          <w:sz w:val="22"/>
-          <w:szCs w:val="22"/>
-        </w:rPr>
-        <w:t xml:space="preserve"> en member4 tenía un flightAssignmentPlanned con una leg que no estaba publicada. Le he hecho estos validadores a PULISH y a UPDATE.</w:t>
+          <w:lang w:val="es-ES"/>
+        </w:rPr>
+      </w:pPr>
+      <w:r>
+        <w:rPr>
+          <w:color w:val="000000"/>
+          <w:sz w:val="22"/>
+          <w:szCs w:val="22"/>
+          <w:lang w:val="es-ES"/>
+        </w:rPr>
+        <w:t>He puesto en los validadores tanto de UPDATE como de PUBLISH que no se puedan llevar a cabo la acción de actualizar o publicar un flightAssignment que la leg no este publicada o en futuro (Aunque no sigue la lógica del create y del Proyecto, me he dado cuenta que si el CSV tenía algun flightAssignmenr con una leg no publicada se podia actualizar o publicar). Despueés de darme cuenta de esto he hecho solucionado todos los fallos del CSV tenía ya que  en member4 tenía un flightAssignmentPlanned con una leg que no estaba publicada. Le he hecho estos validadores a PULISH y a UPDATE.</w:t>
       </w:r>
     </w:p>
     <w:p>
@@ -2624,11 +2624,11 @@
       </w:pPr>
       <w:r>
         <w:rPr>
-          <w:color w:val="000000"/>
-          <w:sz w:val="22"/>
-          <w:szCs w:val="22"/>
-        </w:rPr>
-        <w:lastRenderedPageBreak/>
+          <w:noProof/>
+          <w:color w:val="000000"/>
+          <w:sz w:val="22"/>
+          <w:szCs w:val="22"/>
+        </w:rPr>
         <w:drawing>
           <wp:inline distT="0" distB="0" distL="0" distR="0" wp14:anchorId="218C4B91" wp14:editId="6D54E514">
             <wp:extent cx="5731510" cy="1238250"/>
@@ -2918,7 +2918,7 @@
     </w:p>
     <w:p>
       <w:pPr>
-        <w:pStyle w:val="Ttulo2"/>
+        <w:pStyle w:val="Heading2"/>
       </w:pPr>
       <w:r>
         <w:t>Non-functional requirements</w:t>
@@ -2931,7 +2931,7 @@
     </w:p>
     <w:p>
       <w:pPr>
-        <w:pStyle w:val="Ttulo2"/>
+        <w:pStyle w:val="Heading2"/>
       </w:pPr>
       <w:r>
         <w:t>Testing requirements</w:t>
@@ -2944,7 +2944,7 @@
     </w:p>
     <w:p>
       <w:pPr>
-        <w:pStyle w:val="Ttulo2"/>
+        <w:pStyle w:val="Heading2"/>
       </w:pPr>
       <w:r>
         <w:t>Managerial requirements</w:t>
@@ -3013,10 +3013,9 @@
     </w:p>
     <w:p>
       <w:pPr>
-        <w:pStyle w:val="Ttulo1"/>
-      </w:pPr>
-      <w:r>
-        <w:lastRenderedPageBreak/>
+        <w:pStyle w:val="Heading1"/>
+      </w:pPr>
+      <w:r>
         <w:t xml:space="preserve">MANDATORY </w:t>
       </w:r>
       <w:r>
@@ -3026,7 +3025,7 @@
     </w:p>
     <w:p>
       <w:pPr>
-        <w:pStyle w:val="Ttulo2"/>
+        <w:pStyle w:val="Heading2"/>
       </w:pPr>
       <w:r>
         <w:t xml:space="preserve">Information requirements </w:t>
@@ -3095,7 +3094,7 @@
     </w:p>
     <w:p>
       <w:pPr>
-        <w:pStyle w:val="Ttulo2"/>
+        <w:pStyle w:val="Heading2"/>
       </w:pPr>
       <w:r>
         <w:t>Functional requirements</w:t>
@@ -3108,7 +3107,7 @@
     </w:p>
     <w:p>
       <w:pPr>
-        <w:pStyle w:val="Ttulo2"/>
+        <w:pStyle w:val="Heading2"/>
       </w:pPr>
       <w:r>
         <w:t>Non-functional requirements</w:t>
@@ -3121,7 +3120,7 @@
     </w:p>
     <w:p>
       <w:pPr>
-        <w:pStyle w:val="Ttulo2"/>
+        <w:pStyle w:val="Heading2"/>
       </w:pPr>
       <w:r>
         <w:t>Testing requirements</w:t>
@@ -3187,7 +3186,7 @@
     </w:p>
     <w:p>
       <w:pPr>
-        <w:pStyle w:val="Ttulo2"/>
+        <w:pStyle w:val="Heading2"/>
       </w:pPr>
       <w:r>
         <w:t>Managerial requirements</w:t>
@@ -3320,10 +3319,9 @@
     </w:p>
     <w:p>
       <w:pPr>
-        <w:pStyle w:val="Ttulo1"/>
-      </w:pPr>
-      <w:r>
-        <w:lastRenderedPageBreak/>
+        <w:pStyle w:val="Heading1"/>
+      </w:pPr>
+      <w:r>
         <w:t xml:space="preserve">SUPPLEMENTARY I </w:t>
       </w:r>
       <w:r>
@@ -3333,7 +3331,7 @@
     </w:p>
     <w:p>
       <w:pPr>
-        <w:pStyle w:val="Ttulo2"/>
+        <w:pStyle w:val="Heading2"/>
       </w:pPr>
       <w:r>
         <w:t xml:space="preserve">Information requirements </w:t>
@@ -3346,7 +3344,7 @@
     </w:p>
     <w:p>
       <w:pPr>
-        <w:pStyle w:val="Ttulo2"/>
+        <w:pStyle w:val="Heading2"/>
       </w:pPr>
       <w:r>
         <w:t>Functional requirements</w:t>
@@ -3359,7 +3357,7 @@
     </w:p>
     <w:p>
       <w:pPr>
-        <w:pStyle w:val="Ttulo2"/>
+        <w:pStyle w:val="Heading2"/>
       </w:pPr>
       <w:r>
         <w:t>Non-functional requirements</w:t>
@@ -3372,7 +3370,7 @@
     </w:p>
     <w:p>
       <w:pPr>
-        <w:pStyle w:val="Ttulo2"/>
+        <w:pStyle w:val="Heading2"/>
       </w:pPr>
       <w:r>
         <w:t>Testing requirements</w:t>
@@ -3385,7 +3383,7 @@
     </w:p>
     <w:p>
       <w:pPr>
-        <w:pStyle w:val="Ttulo2"/>
+        <w:pStyle w:val="Heading2"/>
       </w:pPr>
       <w:r>
         <w:t>Managerial requirements</w:t>
@@ -3412,10 +3410,9 @@
     </w:p>
     <w:p>
       <w:pPr>
-        <w:pStyle w:val="Ttulo1"/>
-      </w:pPr>
-      <w:r>
-        <w:lastRenderedPageBreak/>
+        <w:pStyle w:val="Heading1"/>
+      </w:pPr>
+      <w:r>
         <w:t xml:space="preserve">SUPPLEMENTARY I </w:t>
       </w:r>
       <w:r>
@@ -3425,7 +3422,7 @@
     </w:p>
     <w:p>
       <w:pPr>
-        <w:pStyle w:val="Ttulo2"/>
+        <w:pStyle w:val="Heading2"/>
       </w:pPr>
       <w:r>
         <w:t>Information requirements</w:t>
@@ -3640,7 +3637,7 @@
     </w:p>
     <w:p>
       <w:pPr>
-        <w:pStyle w:val="Ttulo2"/>
+        <w:pStyle w:val="Heading2"/>
       </w:pPr>
       <w:r>
         <w:t>Functional requirements</w:t>
@@ -3653,7 +3650,7 @@
     </w:p>
     <w:p>
       <w:pPr>
-        <w:pStyle w:val="Ttulo2"/>
+        <w:pStyle w:val="Heading2"/>
       </w:pPr>
       <w:r>
         <w:t>Non-functional requirements</w:t>
@@ -3666,7 +3663,7 @@
     </w:p>
     <w:p>
       <w:pPr>
-        <w:pStyle w:val="Ttulo2"/>
+        <w:pStyle w:val="Heading2"/>
       </w:pPr>
       <w:r>
         <w:t>Testing requirements</w:t>
@@ -3679,7 +3676,7 @@
     </w:p>
     <w:p>
       <w:pPr>
-        <w:pStyle w:val="Ttulo2"/>
+        <w:pStyle w:val="Heading2"/>
       </w:pPr>
       <w:r>
         <w:t>Managerial requirements</w:t>
@@ -3745,10 +3742,9 @@
     </w:p>
     <w:p>
       <w:pPr>
-        <w:pStyle w:val="Ttulo1"/>
-      </w:pPr>
-      <w:r>
-        <w:lastRenderedPageBreak/>
+        <w:pStyle w:val="Heading1"/>
+      </w:pPr>
+      <w:r>
         <w:t xml:space="preserve">SUPPLEMENTARY I </w:t>
       </w:r>
       <w:r>
@@ -3758,7 +3754,7 @@
     </w:p>
     <w:p>
       <w:pPr>
-        <w:pStyle w:val="Ttulo2"/>
+        <w:pStyle w:val="Heading2"/>
       </w:pPr>
       <w:r>
         <w:t>Information requirements</w:t>
@@ -3771,7 +3767,7 @@
     </w:p>
     <w:p>
       <w:pPr>
-        <w:pStyle w:val="Ttulo2"/>
+        <w:pStyle w:val="Heading2"/>
       </w:pPr>
       <w:r>
         <w:t>Functional requirements</w:t>
@@ -4190,7 +4186,7 @@
     </w:p>
     <w:p>
       <w:pPr>
-        <w:pStyle w:val="Ttulo2"/>
+        <w:pStyle w:val="Heading2"/>
       </w:pPr>
       <w:r>
         <w:t>Non-functional requirements</w:t>
@@ -4203,7 +4199,7 @@
     </w:p>
     <w:p>
       <w:pPr>
-        <w:pStyle w:val="Ttulo2"/>
+        <w:pStyle w:val="Heading2"/>
       </w:pPr>
       <w:r>
         <w:t>Testing requirements</w:t>
@@ -4217,7 +4213,7 @@
     <w:p/>
     <w:p>
       <w:pPr>
-        <w:pStyle w:val="Ttulo2"/>
+        <w:pStyle w:val="Heading2"/>
       </w:pPr>
       <w:r>
         <w:t>Managerial requirements</w:t>
@@ -4273,16 +4269,14 @@
           <w:sz w:val="22"/>
           <w:szCs w:val="22"/>
         </w:rPr>
-        <w:lastRenderedPageBreak/>
         <w:t xml:space="preserve">       </w:t>
       </w:r>
     </w:p>
     <w:p>
       <w:pPr>
-        <w:pStyle w:val="Ttulo1"/>
-      </w:pPr>
-      <w:r>
-        <w:lastRenderedPageBreak/>
+        <w:pStyle w:val="Heading1"/>
+      </w:pPr>
+      <w:r>
         <w:t xml:space="preserve">SUPPLEMENTARY I </w:t>
       </w:r>
       <w:r>
@@ -4292,7 +4286,7 @@
     </w:p>
     <w:p>
       <w:pPr>
-        <w:pStyle w:val="Ttulo2"/>
+        <w:pStyle w:val="Heading2"/>
       </w:pPr>
       <w:r>
         <w:t xml:space="preserve">Information requirements </w:t>
@@ -4305,7 +4299,7 @@
     </w:p>
     <w:p>
       <w:pPr>
-        <w:pStyle w:val="Ttulo2"/>
+        <w:pStyle w:val="Heading2"/>
       </w:pPr>
       <w:r>
         <w:t>Functional requirements</w:t>
@@ -4318,7 +4312,7 @@
     </w:p>
     <w:p>
       <w:pPr>
-        <w:pStyle w:val="Ttulo2"/>
+        <w:pStyle w:val="Heading2"/>
       </w:pPr>
       <w:r>
         <w:t>Non-functional requirements</w:t>
@@ -4331,7 +4325,7 @@
     </w:p>
     <w:p>
       <w:pPr>
-        <w:pStyle w:val="Ttulo2"/>
+        <w:pStyle w:val="Heading2"/>
       </w:pPr>
       <w:r>
         <w:t>Testing requirements</w:t>
@@ -4389,7 +4383,7 @@
     </w:p>
     <w:p>
       <w:pPr>
-        <w:pStyle w:val="Ttulo2"/>
+        <w:pStyle w:val="Heading2"/>
       </w:pPr>
       <w:r>
         <w:t>Managerial requirements</w:t>
@@ -4452,10 +4446,9 @@
     </w:p>
     <w:p>
       <w:pPr>
-        <w:pStyle w:val="Ttulo1"/>
-      </w:pPr>
-      <w:r>
-        <w:lastRenderedPageBreak/>
+        <w:pStyle w:val="Heading1"/>
+      </w:pPr>
+      <w:r>
         <w:t xml:space="preserve">SUPPLEMENTARY II </w:t>
       </w:r>
       <w:r>
@@ -4465,7 +4458,7 @@
     </w:p>
     <w:p>
       <w:pPr>
-        <w:pStyle w:val="Ttulo2"/>
+        <w:pStyle w:val="Heading2"/>
       </w:pPr>
       <w:r>
         <w:t xml:space="preserve">Information requirements </w:t>
@@ -4478,7 +4471,7 @@
     </w:p>
     <w:p>
       <w:pPr>
-        <w:pStyle w:val="Ttulo2"/>
+        <w:pStyle w:val="Heading2"/>
       </w:pPr>
       <w:r>
         <w:t>Functional requirements</w:t>
@@ -4491,7 +4484,7 @@
     </w:p>
     <w:p>
       <w:pPr>
-        <w:pStyle w:val="Ttulo2"/>
+        <w:pStyle w:val="Heading2"/>
       </w:pPr>
       <w:r>
         <w:t>Non-functional requirements</w:t>
@@ -4504,7 +4497,7 @@
     </w:p>
     <w:p>
       <w:pPr>
-        <w:pStyle w:val="Ttulo2"/>
+        <w:pStyle w:val="Heading2"/>
       </w:pPr>
       <w:r>
         <w:t>Testing requirements</w:t>
@@ -4517,7 +4510,7 @@
     </w:p>
     <w:p>
       <w:pPr>
-        <w:pStyle w:val="Ttulo2"/>
+        <w:pStyle w:val="Heading2"/>
       </w:pPr>
       <w:r>
         <w:t>Managerial requirements</w:t>
@@ -4640,20 +4633,21 @@
     </w:p>
     <w:p>
       <w:pPr>
-        <w:pStyle w:val="Ttulo1"/>
-      </w:pPr>
-      <w:r>
-        <w:lastRenderedPageBreak/>
+        <w:pStyle w:val="Heading1"/>
+      </w:pPr>
+      <w:r>
         <w:t xml:space="preserve">SUPPLEMENTARY II </w:t>
       </w:r>
       <w:r>
         <w:br/>
+      </w:r>
+      <w:r>
         <w:t>Deliverable D02: data models</w:t>
       </w:r>
     </w:p>
     <w:p>
       <w:pPr>
-        <w:pStyle w:val="Ttulo2"/>
+        <w:pStyle w:val="Heading2"/>
       </w:pPr>
       <w:r>
         <w:t>Information requirements</w:t>
@@ -4690,7 +4684,13 @@
         <w:rPr>
           <w:color w:val="000000"/>
         </w:rPr>
-        <w:t>.  A web service must be used to populate this entity with information about visa requirements.  Thus, the exact data to store depends on the chosen service, and it is the students' responsibility to define them accordingly.  It is also the students’ responsibility to find the appropriate service; no implicit or explicit liabilities shall be covered by the University of Seville or their individual affiliates if the students hire pay-per-use services!  The students are strongly advised to ensure that the service they choose is free of charge.</w:t>
+        <w:t>.  A web service must be used to populate this entity with information about visa requirements.  Thus, the exact data to store depends on the chosen service, and it is the students' responsibility to define them accordingly.  It is also the students’ responsibility to find the appropriate service; no implicit or explicit liabilities shall be covered by the University of Seville or their individual affiliates if the students hire pay-per-use services!  The students are strongly advised to en</w:t>
+      </w:r>
+      <w:r>
+        <w:rPr>
+          <w:color w:val="000000"/>
+        </w:rPr>
+        <w:t>sure that the service they choose is free of charge.</w:t>
       </w:r>
     </w:p>
     <w:p>
@@ -4724,7 +4724,7 @@
     </w:p>
     <w:p>
       <w:pPr>
-        <w:pStyle w:val="Ttulo2"/>
+        <w:pStyle w:val="Heading2"/>
       </w:pPr>
       <w:r>
         <w:t>Functional requirements</w:t>
@@ -4737,7 +4737,7 @@
     </w:p>
     <w:p>
       <w:pPr>
-        <w:pStyle w:val="Ttulo2"/>
+        <w:pStyle w:val="Heading2"/>
       </w:pPr>
       <w:r>
         <w:t>Non-functional requirements</w:t>
@@ -4750,7 +4750,7 @@
     </w:p>
     <w:p>
       <w:pPr>
-        <w:pStyle w:val="Ttulo2"/>
+        <w:pStyle w:val="Heading2"/>
       </w:pPr>
       <w:r>
         <w:t>Testing requirements</w:t>
@@ -4763,7 +4763,7 @@
     </w:p>
     <w:p>
       <w:pPr>
-        <w:pStyle w:val="Ttulo2"/>
+        <w:pStyle w:val="Heading2"/>
       </w:pPr>
       <w:r>
         <w:t>Managerial requirements</w:t>
@@ -4887,20 +4887,21 @@
     </w:p>
     <w:p>
       <w:pPr>
-        <w:pStyle w:val="Ttulo1"/>
-      </w:pPr>
-      <w:r>
-        <w:lastRenderedPageBreak/>
+        <w:pStyle w:val="Heading1"/>
+      </w:pPr>
+      <w:r>
         <w:t xml:space="preserve">SUPPLEMENTARY II </w:t>
       </w:r>
       <w:r>
         <w:br/>
+      </w:r>
+      <w:r>
         <w:t>Deliverable D03: implementing features</w:t>
       </w:r>
     </w:p>
     <w:p>
       <w:pPr>
-        <w:pStyle w:val="Ttulo2"/>
+        <w:pStyle w:val="Heading2"/>
       </w:pPr>
       <w:r>
         <w:t>Information requirements</w:t>
@@ -4913,7 +4914,7 @@
     </w:p>
     <w:p>
       <w:pPr>
-        <w:pStyle w:val="Ttulo2"/>
+        <w:pStyle w:val="Heading2"/>
       </w:pPr>
       <w:r>
         <w:t>Functional requirements</w:t>
@@ -5138,7 +5139,7 @@
     </w:p>
     <w:p>
       <w:pPr>
-        <w:pStyle w:val="Ttulo2"/>
+        <w:pStyle w:val="Heading2"/>
       </w:pPr>
       <w:r>
         <w:t>Non-functional requirements</w:t>
@@ -5151,7 +5152,7 @@
     </w:p>
     <w:p>
       <w:pPr>
-        <w:pStyle w:val="Ttulo2"/>
+        <w:pStyle w:val="Heading2"/>
       </w:pPr>
       <w:r>
         <w:t>Testing requirements</w:t>
@@ -5164,7 +5165,7 @@
     </w:p>
     <w:p>
       <w:pPr>
-        <w:pStyle w:val="Ttulo2"/>
+        <w:pStyle w:val="Heading2"/>
       </w:pPr>
       <w:r>
         <w:t>Managerial requirements</w:t>
@@ -5277,10 +5278,9 @@
     </w:p>
     <w:p>
       <w:pPr>
-        <w:pStyle w:val="Ttulo1"/>
-      </w:pPr>
-      <w:r>
-        <w:lastRenderedPageBreak/>
+        <w:pStyle w:val="Heading1"/>
+      </w:pPr>
+      <w:r>
         <w:t xml:space="preserve">SUPPLEMENTARY II </w:t>
       </w:r>
       <w:r>
@@ -5290,7 +5290,7 @@
     </w:p>
     <w:p>
       <w:pPr>
-        <w:pStyle w:val="Ttulo2"/>
+        <w:pStyle w:val="Heading2"/>
       </w:pPr>
       <w:r>
         <w:t xml:space="preserve">Information requirements </w:t>
@@ -5303,7 +5303,7 @@
     </w:p>
     <w:p>
       <w:pPr>
-        <w:pStyle w:val="Ttulo2"/>
+        <w:pStyle w:val="Heading2"/>
       </w:pPr>
       <w:r>
         <w:t>Functional requirements</w:t>
@@ -5316,7 +5316,7 @@
     </w:p>
     <w:p>
       <w:pPr>
-        <w:pStyle w:val="Ttulo2"/>
+        <w:pStyle w:val="Heading2"/>
       </w:pPr>
       <w:r>
         <w:t>Non-functional requirements</w:t>
@@ -5329,7 +5329,7 @@
     </w:p>
     <w:p>
       <w:pPr>
-        <w:pStyle w:val="Ttulo2"/>
+        <w:pStyle w:val="Heading2"/>
       </w:pPr>
       <w:r>
         <w:t>Testing requirements</w:t>
@@ -5387,7 +5387,7 @@
     </w:p>
     <w:p>
       <w:pPr>
-        <w:pStyle w:val="Ttulo2"/>
+        <w:pStyle w:val="Heading2"/>
       </w:pPr>
       <w:r>
         <w:t>Managerial requirements</w:t>
@@ -5598,7 +5598,7 @@
     <w:lvl w:ilvl="0">
       <w:start w:val="1"/>
       <w:numFmt w:val="decimal"/>
-      <w:pStyle w:val="Prrafodelista"/>
+      <w:pStyle w:val="ListParagraph"/>
       <w:lvlText w:val="%1."/>
       <w:lvlJc w:val="left"/>
       <w:pPr>
@@ -6322,11 +6322,11 @@
     <w:qFormat/>
     <w:rsid w:val="00F138ED"/>
   </w:style>
-  <w:style w:type="paragraph" w:styleId="Ttulo1">
+  <w:style w:type="paragraph" w:styleId="Heading1">
     <w:name w:val="heading 1"/>
     <w:basedOn w:val="Normal"/>
     <w:next w:val="Normal"/>
-    <w:link w:val="Ttulo1Car"/>
+    <w:link w:val="Heading1Char"/>
     <w:uiPriority w:val="9"/>
     <w:qFormat/>
     <w:rsid w:val="00F138ED"/>
@@ -6352,11 +6352,11 @@
       <w:szCs w:val="28"/>
     </w:rPr>
   </w:style>
-  <w:style w:type="paragraph" w:styleId="Ttulo2">
+  <w:style w:type="paragraph" w:styleId="Heading2">
     <w:name w:val="heading 2"/>
     <w:basedOn w:val="Normal"/>
     <w:next w:val="Normal"/>
-    <w:link w:val="Ttulo2Car"/>
+    <w:link w:val="Heading2Char"/>
     <w:uiPriority w:val="9"/>
     <w:unhideWhenUsed/>
     <w:qFormat/>
@@ -6378,11 +6378,11 @@
       <w:szCs w:val="26"/>
     </w:rPr>
   </w:style>
-  <w:style w:type="paragraph" w:styleId="Ttulo3">
+  <w:style w:type="paragraph" w:styleId="Heading3">
     <w:name w:val="heading 3"/>
     <w:basedOn w:val="Normal"/>
     <w:next w:val="Normal"/>
-    <w:link w:val="Ttulo3Car"/>
+    <w:link w:val="Heading3Char"/>
     <w:uiPriority w:val="9"/>
     <w:semiHidden/>
     <w:unhideWhenUsed/>
@@ -6399,7 +6399,7 @@
       <w:color w:val="1F3763" w:themeColor="accent1" w:themeShade="7F"/>
     </w:rPr>
   </w:style>
-  <w:style w:type="paragraph" w:styleId="Ttulo4">
+  <w:style w:type="paragraph" w:styleId="Heading4">
     <w:name w:val="heading 4"/>
     <w:basedOn w:val="Normal"/>
     <w:next w:val="Normal"/>
@@ -6417,7 +6417,7 @@
       <w:b/>
     </w:rPr>
   </w:style>
-  <w:style w:type="paragraph" w:styleId="Ttulo5">
+  <w:style w:type="paragraph" w:styleId="Heading5">
     <w:name w:val="heading 5"/>
     <w:basedOn w:val="Normal"/>
     <w:next w:val="Normal"/>
@@ -6437,7 +6437,7 @@
       <w:szCs w:val="22"/>
     </w:rPr>
   </w:style>
-  <w:style w:type="paragraph" w:styleId="Ttulo6">
+  <w:style w:type="paragraph" w:styleId="Heading6">
     <w:name w:val="heading 6"/>
     <w:basedOn w:val="Normal"/>
     <w:next w:val="Normal"/>
@@ -6457,13 +6457,13 @@
       <w:szCs w:val="20"/>
     </w:rPr>
   </w:style>
-  <w:style w:type="character" w:default="1" w:styleId="Fuentedeprrafopredeter">
+  <w:style w:type="character" w:default="1" w:styleId="DefaultParagraphFont">
     <w:name w:val="Default Paragraph Font"/>
     <w:uiPriority w:val="1"/>
     <w:semiHidden/>
     <w:unhideWhenUsed/>
   </w:style>
-  <w:style w:type="table" w:default="1" w:styleId="Tablanormal">
+  <w:style w:type="table" w:default="1" w:styleId="TableNormal">
     <w:name w:val="Normal Table"/>
     <w:uiPriority w:val="99"/>
     <w:semiHidden/>
@@ -6478,7 +6478,7 @@
       </w:tblCellMar>
     </w:tblPr>
   </w:style>
-  <w:style w:type="numbering" w:default="1" w:styleId="Sinlista">
+  <w:style w:type="numbering" w:default="1" w:styleId="NoList">
     <w:name w:val="No List"/>
     <w:uiPriority w:val="99"/>
     <w:semiHidden/>
@@ -6495,11 +6495,11 @@
       </w:tblCellMar>
     </w:tblPr>
   </w:style>
-  <w:style w:type="paragraph" w:styleId="Ttulo">
+  <w:style w:type="paragraph" w:styleId="Title">
     <w:name w:val="Title"/>
     <w:basedOn w:val="Normal"/>
     <w:next w:val="Normal"/>
-    <w:link w:val="TtuloCar"/>
+    <w:link w:val="TitleChar"/>
     <w:uiPriority w:val="10"/>
     <w:qFormat/>
     <w:rsid w:val="00F138ED"/>
@@ -6520,10 +6520,10 @@
       <w:szCs w:val="56"/>
     </w:rPr>
   </w:style>
-  <w:style w:type="character" w:customStyle="1" w:styleId="Ttulo1Car">
-    <w:name w:val="Título 1 Car"/>
-    <w:basedOn w:val="Fuentedeprrafopredeter"/>
-    <w:link w:val="Ttulo1"/>
+  <w:style w:type="character" w:customStyle="1" w:styleId="Heading1Char">
+    <w:name w:val="Heading 1 Char"/>
+    <w:basedOn w:val="DefaultParagraphFont"/>
+    <w:link w:val="Heading1"/>
     <w:uiPriority w:val="9"/>
     <w:rsid w:val="00F138ED"/>
     <w:rPr>
@@ -6536,10 +6536,10 @@
       <w:lang w:val="en-GB"/>
     </w:rPr>
   </w:style>
-  <w:style w:type="character" w:customStyle="1" w:styleId="Ttulo2Car">
-    <w:name w:val="Título 2 Car"/>
-    <w:basedOn w:val="Fuentedeprrafopredeter"/>
-    <w:link w:val="Ttulo2"/>
+  <w:style w:type="character" w:customStyle="1" w:styleId="Heading2Char">
+    <w:name w:val="Heading 2 Char"/>
+    <w:basedOn w:val="DefaultParagraphFont"/>
+    <w:link w:val="Heading2"/>
     <w:uiPriority w:val="9"/>
     <w:rsid w:val="00F138ED"/>
     <w:rPr>
@@ -6552,9 +6552,9 @@
       <w:lang w:val="en-GB"/>
     </w:rPr>
   </w:style>
-  <w:style w:type="paragraph" w:styleId="Prrafodelista">
+  <w:style w:type="paragraph" w:styleId="ListParagraph">
     <w:name w:val="List Paragraph"/>
-    <w:basedOn w:val="Listaconnmeros"/>
+    <w:basedOn w:val="ListNumber"/>
     <w:uiPriority w:val="34"/>
     <w:rsid w:val="00F138ED"/>
     <w:pPr>
@@ -6571,7 +6571,7 @@
   </w:style>
   <w:style w:type="paragraph" w:customStyle="1" w:styleId="Prrafodesublista">
     <w:name w:val="Párrafo de sublista"/>
-    <w:basedOn w:val="Prrafodelista"/>
+    <w:basedOn w:val="ListParagraph"/>
     <w:qFormat/>
     <w:rsid w:val="00624D3C"/>
     <w:pPr>
@@ -6604,7 +6604,7 @@
       <w:szCs w:val="22"/>
     </w:rPr>
   </w:style>
-  <w:style w:type="paragraph" w:styleId="Sinespaciado">
+  <w:style w:type="paragraph" w:styleId="NoSpacing">
     <w:name w:val="No Spacing"/>
     <w:uiPriority w:val="1"/>
     <w:rsid w:val="00F138ED"/>
@@ -6612,9 +6612,9 @@
       <w:spacing w:after="0"/>
     </w:pPr>
   </w:style>
-  <w:style w:type="character" w:styleId="Refdecomentario">
+  <w:style w:type="character" w:styleId="CommentReference">
     <w:name w:val="annotation reference"/>
-    <w:basedOn w:val="Fuentedeprrafopredeter"/>
+    <w:basedOn w:val="DefaultParagraphFont"/>
     <w:uiPriority w:val="99"/>
     <w:semiHidden/>
     <w:unhideWhenUsed/>
@@ -6636,7 +6636,7 @@
   </w:style>
   <w:style w:type="paragraph" w:customStyle="1" w:styleId="Requirement-Body">
     <w:name w:val="Requirement - Body"/>
-    <w:basedOn w:val="Lista"/>
+    <w:basedOn w:val="List"/>
     <w:qFormat/>
     <w:rsid w:val="00F138ED"/>
     <w:pPr>
@@ -6646,10 +6646,10 @@
       <w:ind w:left="851" w:hanging="284"/>
     </w:pPr>
   </w:style>
-  <w:style w:type="paragraph" w:styleId="Textocomentario">
+  <w:style w:type="paragraph" w:styleId="CommentText">
     <w:name w:val="annotation text"/>
     <w:basedOn w:val="Normal"/>
-    <w:link w:val="TextocomentarioCar"/>
+    <w:link w:val="CommentTextChar"/>
     <w:uiPriority w:val="99"/>
     <w:unhideWhenUsed/>
     <w:rsid w:val="00F138ED"/>
@@ -6658,10 +6658,10 @@
       <w:szCs w:val="20"/>
     </w:rPr>
   </w:style>
-  <w:style w:type="character" w:customStyle="1" w:styleId="TextocomentarioCar">
-    <w:name w:val="Texto comentario Car"/>
-    <w:basedOn w:val="Fuentedeprrafopredeter"/>
-    <w:link w:val="Textocomentario"/>
+  <w:style w:type="character" w:customStyle="1" w:styleId="CommentTextChar">
+    <w:name w:val="Comment Text Char"/>
+    <w:basedOn w:val="DefaultParagraphFont"/>
+    <w:link w:val="CommentText"/>
     <w:uiPriority w:val="99"/>
     <w:rsid w:val="00F138ED"/>
     <w:rPr>
@@ -6670,11 +6670,11 @@
       <w:lang w:val="en-GB"/>
     </w:rPr>
   </w:style>
-  <w:style w:type="paragraph" w:styleId="Asuntodelcomentario">
+  <w:style w:type="paragraph" w:styleId="CommentSubject">
     <w:name w:val="annotation subject"/>
     <w:basedOn w:val="Normal"/>
     <w:next w:val="Normal"/>
-    <w:link w:val="AsuntodelcomentarioCar"/>
+    <w:link w:val="CommentSubjectChar"/>
     <w:uiPriority w:val="99"/>
     <w:semiHidden/>
     <w:unhideWhenUsed/>
@@ -6686,10 +6686,10 @@
       <w:szCs w:val="20"/>
     </w:rPr>
   </w:style>
-  <w:style w:type="character" w:customStyle="1" w:styleId="AsuntodelcomentarioCar">
-    <w:name w:val="Asunto del comentario Car"/>
-    <w:basedOn w:val="Fuentedeprrafopredeter"/>
-    <w:link w:val="Asuntodelcomentario"/>
+  <w:style w:type="character" w:customStyle="1" w:styleId="CommentSubjectChar">
+    <w:name w:val="Comment Subject Char"/>
+    <w:basedOn w:val="DefaultParagraphFont"/>
+    <w:link w:val="CommentSubject"/>
     <w:uiPriority w:val="99"/>
     <w:semiHidden/>
     <w:rsid w:val="00F138ED"/>
@@ -6701,7 +6701,7 @@
       <w:lang w:val="en-GB"/>
     </w:rPr>
   </w:style>
-  <w:style w:type="paragraph" w:styleId="Lista">
+  <w:style w:type="paragraph" w:styleId="List">
     <w:name w:val="List"/>
     <w:basedOn w:val="Normal"/>
     <w:uiPriority w:val="99"/>
@@ -6713,9 +6713,9 @@
       <w:contextualSpacing/>
     </w:pPr>
   </w:style>
-  <w:style w:type="character" w:styleId="Textoennegrita">
+  <w:style w:type="character" w:styleId="Strong">
     <w:name w:val="Strong"/>
-    <w:basedOn w:val="Fuentedeprrafopredeter"/>
+    <w:basedOn w:val="DefaultParagraphFont"/>
     <w:uiPriority w:val="22"/>
     <w:qFormat/>
     <w:rsid w:val="00F138ED"/>
@@ -6724,9 +6724,9 @@
       <w:bCs/>
     </w:rPr>
   </w:style>
-  <w:style w:type="character" w:styleId="Hipervnculo">
+  <w:style w:type="character" w:styleId="Hyperlink">
     <w:name w:val="Hyperlink"/>
-    <w:basedOn w:val="Fuentedeprrafopredeter"/>
+    <w:basedOn w:val="DefaultParagraphFont"/>
     <w:uiPriority w:val="99"/>
     <w:unhideWhenUsed/>
     <w:rsid w:val="00F138ED"/>
@@ -6735,9 +6735,9 @@
       <w:u w:val="single"/>
     </w:rPr>
   </w:style>
-  <w:style w:type="character" w:styleId="Textodelmarcadordeposicin">
+  <w:style w:type="character" w:styleId="PlaceholderText">
     <w:name w:val="Placeholder Text"/>
-    <w:basedOn w:val="Fuentedeprrafopredeter"/>
+    <w:basedOn w:val="DefaultParagraphFont"/>
     <w:uiPriority w:val="99"/>
     <w:semiHidden/>
     <w:rsid w:val="00F138ED"/>
@@ -6747,7 +6747,7 @@
   </w:style>
   <w:style w:type="paragraph" w:customStyle="1" w:styleId="Requirement-Header">
     <w:name w:val="Requirement - Header"/>
-    <w:basedOn w:val="Lista"/>
+    <w:basedOn w:val="List"/>
     <w:next w:val="Requirement-Body"/>
     <w:qFormat/>
     <w:rsid w:val="0059559E"/>
@@ -6758,10 +6758,10 @@
       <w:ind w:left="567" w:hanging="567"/>
     </w:pPr>
   </w:style>
-  <w:style w:type="character" w:customStyle="1" w:styleId="Ttulo3Car">
-    <w:name w:val="Título 3 Car"/>
-    <w:basedOn w:val="Fuentedeprrafopredeter"/>
-    <w:link w:val="Ttulo3"/>
+  <w:style w:type="character" w:customStyle="1" w:styleId="Heading3Char">
+    <w:name w:val="Heading 3 Char"/>
+    <w:basedOn w:val="DefaultParagraphFont"/>
+    <w:link w:val="Heading3"/>
     <w:uiPriority w:val="9"/>
     <w:rsid w:val="00F138ED"/>
     <w:rPr>
@@ -6772,7 +6772,7 @@
       <w:lang w:val="en-GB"/>
     </w:rPr>
   </w:style>
-  <w:style w:type="paragraph" w:styleId="Listaconnmeros">
+  <w:style w:type="paragraph" w:styleId="ListNumber">
     <w:name w:val="List Number"/>
     <w:basedOn w:val="Normal"/>
     <w:uiPriority w:val="99"/>
@@ -6787,10 +6787,10 @@
       <w:contextualSpacing/>
     </w:pPr>
   </w:style>
-  <w:style w:type="character" w:customStyle="1" w:styleId="TtuloCar">
-    <w:name w:val="Título Car"/>
-    <w:basedOn w:val="Fuentedeprrafopredeter"/>
-    <w:link w:val="Ttulo"/>
+  <w:style w:type="character" w:customStyle="1" w:styleId="TitleChar">
+    <w:name w:val="Title Char"/>
+    <w:basedOn w:val="DefaultParagraphFont"/>
+    <w:link w:val="Title"/>
     <w:uiPriority w:val="10"/>
     <w:rsid w:val="00F138ED"/>
     <w:rPr>
@@ -6802,9 +6802,9 @@
       <w:lang w:val="en-GB"/>
     </w:rPr>
   </w:style>
-  <w:style w:type="character" w:styleId="Mencionar">
+  <w:style w:type="character" w:styleId="Mention">
     <w:name w:val="Mention"/>
-    <w:basedOn w:val="Fuentedeprrafopredeter"/>
+    <w:basedOn w:val="DefaultParagraphFont"/>
     <w:uiPriority w:val="99"/>
     <w:unhideWhenUsed/>
     <w:rsid w:val="00F138ED"/>
@@ -6813,7 +6813,7 @@
       <w:shd w:val="clear" w:color="auto" w:fill="E1DFDD"/>
     </w:rPr>
   </w:style>
-  <w:style w:type="paragraph" w:styleId="Subttulo">
+  <w:style w:type="paragraph" w:styleId="Subtitle">
     <w:name w:val="Subtitle"/>
     <w:basedOn w:val="Normal"/>
     <w:next w:val="Normal"/>

</xml_diff>